<commit_message>
Doc für ffmpeg extrakt
</commit_message>
<xml_diff>
--- a/doc/features_en.docx
+++ b/doc/features_en.docx
@@ -103,7 +103,7 @@
         <w:pStyle w:val="Aufzhlungszeichen"/>
       </w:pPr>
       <w:r>
-        <w:t>Video export (Copy Mode = fast, Encode Mode = slow with crossfades/overlays)</w:t>
+        <w:t xml:space="preserve">Video export (Copy Mode = fast, needs ffmpeg on your computer; Encode Mode = slow with crossfades/overlays)</w:t>
       </w:r>
     </w:p>
     <w:p>
@@ -119,7 +119,7 @@
         <w:pStyle w:val="Aufzhlungszeichen"/>
       </w:pPr>
       <w:r>
-        <w:t>360° Video View</w:t>
+        <w:t xml:space="preserve">360° video: real projection with mouse pan and wheel zoom, one viewing direction per video, and the view is rendered into the export</w:t>
       </w:r>
     </w:p>
     <w:p>

</xml_diff>